<commit_message>
Report: appendix in the guideline format (Turnitin page, table Gantt chart), flow-style conceptual framework, 16 GB version of the user's report
</commit_message>
<xml_diff>
--- a/docs/report/ISproject_Esborn_Kihiu_Ch1-6.docx
+++ b/docs/report/ISproject_Esborn_Kihiu_Ch1-6.docx
@@ -2016,6 +2016,23 @@
       <w:r>
         <w:t xml:space="preserve">61</w:t>
       </w:r>
+    </w:p>
+    <w:p>
+      <w:pPr>
+        <w:pStyle w:val="TOC1"/>
+        <w:tabs>
+          <w:tab w:val="right" w:pos="9360" w:leader="dot"/>
+        </w:tabs>
+      </w:pPr>
+      <w:r>
+        <w:t xml:space="preserve">Appendix</w:t>
+      </w:r>
+      <w:r>
+        <w:t xml:space="preserve">	</w:t>
+      </w:r>
+      <w:r>
+        <w:t xml:space="preserve">65</w:t>
+      </w:r>
       <w:r>
         <w:fldChar w:fldCharType="end"/>
       </w:r>
@@ -2274,6 +2291,40 @@
       </w:r>
       <w:r>
         <w:t xml:space="preserve">50</w:t>
+      </w:r>
+    </w:p>
+    <w:p>
+      <w:pPr>
+        <w:pStyle w:val="TableofFigures"/>
+        <w:tabs>
+          <w:tab w:val="right" w:pos="9360" w:leader="dot"/>
+        </w:tabs>
+      </w:pPr>
+      <w:r>
+        <w:t xml:space="preserve">Appendix A: Turnitin similarity report</w:t>
+      </w:r>
+      <w:r>
+        <w:t xml:space="preserve">	</w:t>
+      </w:r>
+      <w:r>
+        <w:t xml:space="preserve">65</w:t>
+      </w:r>
+    </w:p>
+    <w:p>
+      <w:pPr>
+        <w:pStyle w:val="TableofFigures"/>
+        <w:tabs>
+          <w:tab w:val="right" w:pos="9360" w:leader="dot"/>
+        </w:tabs>
+      </w:pPr>
+      <w:r>
+        <w:t xml:space="preserve">Appendix B: Gantt Chart</w:t>
+      </w:r>
+      <w:r>
+        <w:t xml:space="preserve">	</w:t>
+      </w:r>
+      <w:r>
+        <w:t xml:space="preserve">65</w:t>
       </w:r>
       <w:r>
         <w:fldChar w:fldCharType="end"/>
@@ -32961,6 +33012,125 @@
       </w:r>
       <w:r>
         <w:t xml:space="preserve">. Retrieved October 14, 2026, from https://www.zabbix.com/documentation/7.0/en/manual</w:t>
+      </w:r>
+    </w:p>
+    <w:p>
+      <w:pPr>
+        <w:pStyle w:val="Heading1"/>
+        <w:pageBreakBefore/>
+      </w:pPr>
+      <w:r>
+        <w:t xml:space="preserve">Appendix</w:t>
+      </w:r>
+    </w:p>
+    <w:p>
+      <w:pPr>
+        <w:keepNext/>
+        <w:spacing w:after="60" w:before="120" w:line="240"/>
+        <w:jc w:val="center"/>
+      </w:pPr>
+      <w:r>
+        <w:drawing>
+          <wp:inline distT="0" distB="0" distL="0" distR="0">
+            <wp:extent cx="5486400" cy="3429000"/>
+            <wp:effectExtent t="0" r="0" b="0" l="0"/>
+            <wp:docPr id="16" name="" descr="" title=""/>
+            <wp:cNvGraphicFramePr>
+              <a:graphicFrameLocks xmlns:a="http://schemas.openxmlformats.org/drawingml/2006/main" noChangeAspect="1"/>
+            </wp:cNvGraphicFramePr>
+            <a:graphic xmlns:a="http://schemas.openxmlformats.org/drawingml/2006/main">
+              <a:graphicData uri="http://schemas.openxmlformats.org/drawingml/2006/picture">
+                <pic:pic xmlns:pic="http://schemas.openxmlformats.org/drawingml/2006/picture">
+                  <pic:nvPicPr>
+                    <pic:cNvPr id="0" name="" descr=""/>
+                    <pic:cNvPicPr>
+                      <a:picLocks noChangeAspect="1" noChangeArrowheads="1"/>
+                    </pic:cNvPicPr>
+                  </pic:nvPicPr>
+                  <pic:blipFill>
+                    <a:blip r:embed="rId25" cstate="none"/>
+                    <a:srcRect/>
+                    <a:stretch>
+                      <a:fillRect/>
+                    </a:stretch>
+                  </pic:blipFill>
+                  <pic:spPr bwMode="auto">
+                    <a:xfrm>
+                      <a:off x="0" y="0"/>
+                      <a:ext cx="5486400" cy="3429000"/>
+                    </a:xfrm>
+                    <a:prstGeom prst="rect">
+                      <a:avLst/>
+                    </a:prstGeom>
+                  </pic:spPr>
+                </pic:pic>
+              </a:graphicData>
+            </a:graphic>
+          </wp:inline>
+        </w:drawing>
+      </w:r>
+    </w:p>
+    <w:p>
+      <w:pPr>
+        <w:pStyle w:val="FigureCaption"/>
+      </w:pPr>
+      <w:r>
+        <w:t xml:space="preserve">Appendix A: Turnitin similarity report</w:t>
+      </w:r>
+    </w:p>
+    <w:p>
+      <w:pPr>
+        <w:keepNext/>
+        <w:spacing w:after="60" w:before="120" w:line="240"/>
+        <w:jc w:val="center"/>
+      </w:pPr>
+      <w:r>
+        <w:drawing>
+          <wp:inline distT="0" distB="0" distL="0" distR="0">
+            <wp:extent cx="5762625" cy="1562100"/>
+            <wp:effectExtent t="0" r="0" b="0" l="0"/>
+            <wp:docPr id="17" name="" descr="" title=""/>
+            <wp:cNvGraphicFramePr>
+              <a:graphicFrameLocks xmlns:a="http://schemas.openxmlformats.org/drawingml/2006/main" noChangeAspect="1"/>
+            </wp:cNvGraphicFramePr>
+            <a:graphic xmlns:a="http://schemas.openxmlformats.org/drawingml/2006/main">
+              <a:graphicData uri="http://schemas.openxmlformats.org/drawingml/2006/picture">
+                <pic:pic xmlns:pic="http://schemas.openxmlformats.org/drawingml/2006/picture">
+                  <pic:nvPicPr>
+                    <pic:cNvPr id="0" name="" descr=""/>
+                    <pic:cNvPicPr>
+                      <a:picLocks noChangeAspect="1" noChangeArrowheads="1"/>
+                    </pic:cNvPicPr>
+                  </pic:nvPicPr>
+                  <pic:blipFill>
+                    <a:blip r:embed="rId26" cstate="none"/>
+                    <a:srcRect/>
+                    <a:stretch>
+                      <a:fillRect/>
+                    </a:stretch>
+                  </pic:blipFill>
+                  <pic:spPr bwMode="auto">
+                    <a:xfrm>
+                      <a:off x="0" y="0"/>
+                      <a:ext cx="5762625" cy="1562100"/>
+                    </a:xfrm>
+                    <a:prstGeom prst="rect">
+                      <a:avLst/>
+                    </a:prstGeom>
+                  </pic:spPr>
+                </pic:pic>
+              </a:graphicData>
+            </a:graphic>
+          </wp:inline>
+        </w:drawing>
+      </w:r>
+    </w:p>
+    <w:p>
+      <w:pPr>
+        <w:pStyle w:val="FigureCaption"/>
+      </w:pPr>
+      <w:r>
+        <w:t xml:space="preserve">Appendix B: Gantt Chart</w:t>
       </w:r>
     </w:p>
     <w:sectPr>

</xml_diff>